<commit_message>
Corrige espacio excesivo y salto de pagina en Orden de Sancion
Entre el analisis y la DECISION quedaban 3 parrafos vacios sueltos de
la edicion original (ahora solo 1, como separador). Ademas la seccion
"NOTIFICACION Y ENTREGA DE ACTO ADMINISTRATIVO" dependia de que el
contenido anterior llenara la pagina para caer al inicio de la
siguiente; ahora tiene un salto de pagina real, asi que siempre
empieza arriba sin importar cuanto texto tenga el analisis.
</commit_message>
<xml_diff>
--- a/plantillas/plantilla_orden_sancion.docx
+++ b/plantillas/plantilla_orden_sancion.docx
@@ -725,86 +725,6 @@
           <w:bCs/>
           <w:sz w:val="24"/>
           <w:szCs w:val="24"/>
-        </w:rPr>
-        <w:t xml:space="preserve"/>
-      </w:r>
-    </w:p>
-    <w:p>
-      <w:pPr>
-        <w:pStyle w:val="Prrafodelista"/>
-        <w:tabs>
-          <w:tab w:val="left" w:pos="3544"/>
-        </w:tabs>
-        <w:ind w:left="215"/>
-        <w:jc w:val="both"/>
-        <w:rPr>
-          <w:rFonts w:ascii="Arial" w:hAnsi="Arial" w:cs="Arial"/>
-          <w:b/>
-          <w:sz w:val="24"/>
-          <w:szCs w:val="24"/>
-        </w:rPr>
-      </w:pPr>
-    </w:p>
-    <w:p>
-      <w:pPr>
-        <w:pStyle w:val="Prrafodelista"/>
-        <w:tabs>
-          <w:tab w:val="left" w:pos="3544"/>
-        </w:tabs>
-        <w:ind w:left="215"/>
-        <w:jc w:val="both"/>
-        <w:rPr>
-          <w:rFonts w:ascii="Arial" w:hAnsi="Arial" w:cs="Arial"/>
-          <w:sz w:val="24"/>
-          <w:szCs w:val="24"/>
-        </w:rPr>
-      </w:pPr>
-      <w:r>
-        <w:rPr>
-          <w:rFonts w:ascii="Arial" w:hAnsi="Arial" w:cs="Arial"/>
-          <w:sz w:val="24"/>
-          <w:szCs w:val="24"/>
-          <w:lang w:val="es-ES"/>
-        </w:rPr>
-        <w:t xml:space="preserve"/>
-      </w:r>
-      <w:proofErr w:type="spellStart"/>
-      <w:r>
-        <w:rPr>
-          <w:rFonts w:ascii="Arial" w:hAnsi="Arial" w:cs="Arial"/>
-          <w:sz w:val="24"/>
-          <w:szCs w:val="24"/>
-          <w:lang w:val="es-ES"/>
-        </w:rPr>
-        <w:t/>
-      </w:r>
-      <w:proofErr w:type="spellEnd"/>
-      <w:r>
-        <w:rPr>
-          <w:rFonts w:ascii="Arial" w:hAnsi="Arial" w:cs="Arial"/>
-          <w:sz w:val="24"/>
-          <w:szCs w:val="24"/>
-          <w:lang w:val="es-ES"/>
-        </w:rPr>
-        <w:t xml:space="preserve"/>
-      </w:r>
-      <w:proofErr w:type="spellStart"/>
-      <w:r>
-        <w:rPr>
-          <w:rFonts w:ascii="Arial" w:hAnsi="Arial" w:cs="Arial"/>
-          <w:sz w:val="24"/>
-          <w:szCs w:val="24"/>
-          <w:lang w:val="es-ES"/>
-        </w:rPr>
-        <w:t/>
-      </w:r>
-      <w:proofErr w:type="spellEnd"/>
-      <w:r>
-        <w:rPr>
-          <w:rFonts w:ascii="Arial" w:hAnsi="Arial" w:cs="Arial"/>
-          <w:sz w:val="24"/>
-          <w:szCs w:val="24"/>
-          <w:lang w:val="es-ES"/>
         </w:rPr>
         <w:t xml:space="preserve"/>
       </w:r>
@@ -2675,7 +2595,17 @@
           <w:u w:val="single"/>
           <w:lang w:val="es-PE"/>
         </w:rPr>
-        <w:lastRenderedPageBreak/>
+        <w:br w:type="page"/>
+      </w:r>
+      <w:r>
+        <w:rPr>
+          <w:rFonts w:cs="Arial"/>
+          <w:b/>
+          <w:sz w:val="24"/>
+          <w:szCs w:val="24"/>
+          <w:u w:val="single"/>
+          <w:lang w:val="es-PE"/>
+        </w:rPr>
         <w:t>NOTIFICACIÓN Y ENTREGA DE ACTO ADMINISTRATIVO</w:t>
       </w:r>
     </w:p>

</xml_diff>

<commit_message>
Revierte el salto de pagina forzado que dejaba una hoja en blanco
Al quitar los 3 parrafos vacios sobrantes entre el analisis y la
DECISION (commit anterior), la seccion de Notificacion ya cae sola al
inicio de una hoja nueva sin necesidad de forzar nada. El salto de
pagina que agregue ademas de eso duplicaba el salto y dejaba una hoja
en blanco entre la firma y la Notificacion. Verificado exportando a
PDF con Word (COM) antes y despues del cambio: sin el salto forzado
salen 4 paginas sin ninguna en blanco.
</commit_message>
<xml_diff>
--- a/plantillas/plantilla_orden_sancion.docx
+++ b/plantillas/plantilla_orden_sancion.docx
@@ -2586,17 +2586,6 @@
           <w:lang w:val="es-PE"/>
         </w:rPr>
       </w:pPr>
-      <w:r>
-        <w:rPr>
-          <w:rFonts w:cs="Arial"/>
-          <w:b/>
-          <w:sz w:val="24"/>
-          <w:szCs w:val="24"/>
-          <w:u w:val="single"/>
-          <w:lang w:val="es-PE"/>
-        </w:rPr>
-        <w:br w:type="page"/>
-      </w:r>
       <w:r>
         <w:rPr>
           <w:rFonts w:cs="Arial"/>

</xml_diff>

<commit_message>
Completa el domicilio y corrige alineacion del nombre del investigado
- Domicilio en la seccion de Notificacion estaba vacio, ahora dice
  "DIVOPUS 3-CPNP VENTANILLA" como el resto de la plantilla.
- Cuando el grado y nombre del investigado es largo y pasa a una
  segunda linea, esa linea ahora queda alineada justo debajo del
  inicio del valor (la "S" de S1, etc.), no mas a la izquierda.
  Ajustado con base en la posicion real medida via Word (COM),
  no a ojo.
</commit_message>
<xml_diff>
--- a/plantillas/plantilla_orden_sancion.docx
+++ b/plantillas/plantilla_orden_sancion.docx
@@ -136,7 +136,7 @@
         <w:tabs>
           <w:tab w:val="left" w:pos="3544"/>
         </w:tabs>
-        <w:ind w:left="4678" w:hanging="4678"/>
+        <w:ind w:left="4840" w:hanging="4840"/>
         <w:jc w:val="both"/>
         <w:rPr>
           <w:rFonts w:cs="Arial"/>
@@ -2804,7 +2804,7 @@
           <w:bCs/>
           <w:sz w:val="20"/>
         </w:rPr>
-        <w:t xml:space="preserve"/>
+        <w:t xml:space="preserve">DIVOPUS 3-CPNP VENTANILLA</w:t>
       </w:r>
     </w:p>
     <w:p>

</xml_diff>